<commit_message>
docs: alinhar arquitetura do gerador de etiquetas
</commit_message>
<xml_diff>
--- a/output/docx/gerador-etiquetas-l42pro-system-design.docx
+++ b/output/docx/gerador-etiquetas-l42pro-system-design.docx
@@ -4142,7 +4142,7 @@
       </w:pPr>
       <w:r>
         <w:rPr w:lang="pt-BR"/>
-        <w:t>src/lib/standardTextLabels.ts e na migration 20270101013100_standardize_l42pro_label_templates.sql.</w:t>
+        <w:t>src/lib/standardTextLabels.ts e na migration 20270101013050_standardize_l42pro_label_templates.sql.</w:t>
       </w:r>
     </w:p>
     <w:p>
@@ -4907,7 +4907,7 @@
       </w:pPr>
       <w:r>
         <w:rPr w:lang="pt-BR"/>
-        <w:t>A política de leitura retorna apenas os dois modelos oficiais ativos para usuários aprovados.</w:t>
+        <w:t>A política de leitura permite que usuários aprovados consultem os modelos oficiais e os legados inativos, preservando os nomes no histórico.</w:t>
       </w:r>
     </w:p>
     <w:p>
@@ -6785,7 +6785,7 @@
       </w:pPr>
       <w:r>
         <w:rPr w:lang="pt-BR"/>
-        <w:t>Após estabilização, os módulos mortos do designer livre devem ser removidos em limpeza técnica separada?</w:t>
+        <w:t>Quem executará e registrará o teste físico de dez ciclos na L42PRO do posto?</w:t>
       </w:r>
     </w:p>
     <w:p>

</xml_diff>